<commit_message>
change report font color
</commit_message>
<xml_diff>
--- a/metqc/inst/extdata/quartet_template.docx
+++ b/metqc/inst/extdata/quartet_template.docx
@@ -927,6 +927,7 @@
     <w:uiPriority w:val="9"/>
     <w:unhideWhenUsed/>
     <w:qFormat/>
+    <w:rsid w:val="00A87EF8"/>
     <w:pPr>
       <w:keepNext/>
       <w:keepLines/>
@@ -937,7 +938,7 @@
       <w:rFonts w:eastAsiaTheme="majorEastAsia" w:cstheme="majorBidi"/>
       <w:b/>
       <w:bCs/>
-      <w:sz w:val="36"/>
+      <w:sz w:val="28"/>
       <w:szCs w:val="26"/>
     </w:rPr>
   </w:style>
@@ -949,6 +950,7 @@
     <w:uiPriority w:val="9"/>
     <w:unhideWhenUsed/>
     <w:qFormat/>
+    <w:rsid w:val="00A87EF8"/>
     <w:pPr>
       <w:keepNext/>
       <w:keepLines/>
@@ -959,7 +961,7 @@
       <w:rFonts w:eastAsiaTheme="majorEastAsia" w:cstheme="majorBidi"/>
       <w:b/>
       <w:bCs/>
-      <w:sz w:val="32"/>
+      <w:sz w:val="28"/>
     </w:rPr>
   </w:style>
   <w:style w:type="paragraph" w:styleId="4">
@@ -1310,12 +1312,14 @@
     <w:basedOn w:val="a0"/>
     <w:link w:val="2"/>
     <w:uiPriority w:val="9"/>
-    <w:rPr>
-      <w:rFonts w:ascii="Arial" w:eastAsiaTheme="majorEastAsia" w:hAnsi="Arial" w:cstheme="majorBidi"/>
+    <w:rsid w:val="00A87EF8"/>
+    <w:rPr>
+      <w:rFonts w:ascii="Times New Roman" w:eastAsiaTheme="majorEastAsia" w:hAnsi="Times New Roman" w:cstheme="majorBidi"/>
       <w:b/>
       <w:bCs/>
-      <w:sz w:val="36"/>
+      <w:sz w:val="28"/>
       <w:szCs w:val="26"/>
+      <w:lang w:eastAsia="en-US"/>
     </w:rPr>
   </w:style>
   <w:style w:type="character" w:customStyle="1" w:styleId="30">
@@ -1323,11 +1327,14 @@
     <w:basedOn w:val="a0"/>
     <w:link w:val="3"/>
     <w:uiPriority w:val="9"/>
-    <w:rPr>
-      <w:rFonts w:ascii="Arial" w:eastAsiaTheme="majorEastAsia" w:hAnsi="Arial" w:cstheme="majorBidi"/>
+    <w:rsid w:val="00A87EF8"/>
+    <w:rPr>
+      <w:rFonts w:ascii="Times New Roman" w:eastAsiaTheme="majorEastAsia" w:hAnsi="Times New Roman" w:cstheme="majorBidi"/>
       <w:b/>
       <w:bCs/>
-      <w:sz w:val="32"/>
+      <w:sz w:val="28"/>
+      <w:szCs w:val="24"/>
+      <w:lang w:eastAsia="en-US"/>
     </w:rPr>
   </w:style>
   <w:style w:type="paragraph" w:customStyle="1" w:styleId="ImageCaption">

</xml_diff>